<commit_message>
Condense Talakunchi CV experience
</commit_message>
<xml_diff>
--- a/Hardee_CV.docx
+++ b/Hardee_CV.docx
@@ -135,7 +135,7 @@
         </w:numPr>
       </w:pPr>
       <w:r>
-        <w:t>Monitored and triaged ELK alerts, reviewing events to identify activity requiring further investigation or escalation.</w:t>
+        <w:t>Monitored ELK alerts and investigated events requiring further review.</w:t>
       </w:r>
     </w:p>
     <w:p>
@@ -146,7 +146,7 @@
         </w:numPr>
       </w:pPr>
       <w:r>
-        <w:t>Performed Imperva WAF analysis by reviewing IP reputation, hit counts, whitelist status and ISP context to assess suspicious or malicious activity.</w:t>
+        <w:t>Performed Imperva WAF analysis to identify suspicious or malicious IP activity.</w:t>
       </w:r>
     </w:p>
     <w:p>
@@ -157,29 +157,7 @@
         </w:numPr>
       </w:pPr>
       <w:r>
-        <w:t>Investigated SQL injection activity from an unwhitelisted IP with a high VirusTotal score and escalated the finding for blocking and further review.</w:t>
-      </w:r>
-    </w:p>
-    <w:p>
-      <w:pPr>
-        <w:numPr>
-          <w:ilvl w:val="0"/>
-          <w:numId w:val="7"/>
-        </w:numPr>
-      </w:pPr>
-      <w:r>
-        <w:t>Used Attack Analytics to analyse incidents by attack pattern and type, then acknowledged alerts according to incident severity and status with clear investigation notes.</w:t>
-      </w:r>
-    </w:p>
-    <w:p>
-      <w:pPr>
-        <w:numPr>
-          <w:ilvl w:val="0"/>
-          <w:numId w:val="7"/>
-        </w:numPr>
-      </w:pPr>
-      <w:r>
-        <w:t>Escalated a suspicious IP associated with an unfamiliar ISP after identifying indicators that required additional team review.</w:t>
+        <w:t>Reviewed Attack Analytics incidents and acknowledged alerts with investigation notes.</w:t>
       </w:r>
     </w:p>
     <w:p>

</xml_diff>

<commit_message>
Use final Talakunchi experience bullets
</commit_message>
<xml_diff>
--- a/Hardee_CV.docx
+++ b/Hardee_CV.docx
@@ -135,7 +135,7 @@
         </w:numPr>
       </w:pPr>
       <w:r>
-        <w:t>Monitored ELK alerts and investigated events requiring further review.</w:t>
+        <w:t>Monitored and analysed Imperva WAF events, investigating source IPs, hit counts, attack patterns, ISP information, and threat intelligence to identify suspicious or malicious activity.</w:t>
       </w:r>
     </w:p>
     <w:p>
@@ -146,7 +146,7 @@
         </w:numPr>
       </w:pPr>
       <w:r>
-        <w:t>Performed Imperva WAF analysis to identify suspicious or malicious IP activity.</w:t>
+        <w:t>Performed ELK alert monitoring and triage, analysing security events, identifying potential false positives, and documenting findings and required actions.</w:t>
       </w:r>
     </w:p>
     <w:p>
@@ -157,7 +157,18 @@
         </w:numPr>
       </w:pPr>
       <w:r>
-        <w:t>Reviewed Attack Analytics incidents and acknowledged alerts with investigation notes.</w:t>
+        <w:t>Analysed Attack Analytics incidents based on attack type, severity, and incident status, investigating associated IPs and documenting analysis findings during alert acknowledgement.</w:t>
+      </w:r>
+    </w:p>
+    <w:p>
+      <w:pPr>
+        <w:numPr>
+          <w:ilvl w:val="0"/>
+          <w:numId w:val="7"/>
+        </w:numPr>
+      </w:pPr>
+      <w:r>
+        <w:t>Investigated web-based attacks including SQL Injection, correlating WAF activity with VirusTotal reputation, whitelist status, and other indicators to support blocking or monitoring decisions.</w:t>
       </w:r>
     </w:p>
     <w:p>

</xml_diff>